<commit_message>
Update ABSA docs and expand .gitignore
  Update dataset labeling and model training methodology docx files.
  Expand .gitignore to exclude model checkpoints, baseline pickles,
  generated data splits, annotation caches, and scratch scripts.
</commit_message>
<xml_diff>
--- a/absa/docs/dataset_labeling_methodology.docx
+++ b/absa/docs/dataset_labeling_methodology.docx
@@ -5192,7 +5192,7 @@
           <w:sz w:val="24"/>
           <w:szCs w:val="24"/>
         </w:rPr>
-        <w:t xml:space="preserve">. Ding et al. (2023) demonstrated that GPT-3 achieves competitive annotation quality relative to trained human annotators on tasks including named entity recognition, relation extraction, and sentiment analysis, often at a fraction of the cost. More recent work with GPT-4 has reported 88.4% agreement with human ground truth versus 86% for skilled human annotators, while being approximately 20× faster and 7× cheaper.</w:t>
+        <w:t xml:space="preserve">. Ding et al. (2023) demonstrated that GPT-3 achieves competitive annotation quality relative to trained human annotators on tasks including named entity recognition, relation extraction, and sentiment analysis, often at a fraction of the cost. Subsequent work with more capable models has consistently widened this gap, motivating the use of GPT-4o-mini as the primary labeler in this pipeline.</w:t>
       </w:r>
     </w:p>
     <w:p>
@@ -16863,7 +16863,25 @@
           <w:sz w:val="22"/>
           <w:szCs w:val="22"/>
         </w:rPr>
-        <w:t xml:space="preserve">Laurer, M. (2023). mDeBERTa-v3-base-xnli-multilingual-nli-2mil7 [Model card]. Hugging Face. https://huggingface.co/MoritzLaurer/mDeBERTa-v3-base-xnli-multilingual-nli-2mil7</w:t>
+        <w:t xml:space="preserve">Laurer, M., van Atteveldt, W., Casas, A., &amp; Welbers, K. (2023). Building efficient universal classifiers with natural language inference. </w:t>
+      </w:r>
+      <w:r>
+        <w:rPr>
+          <w:rFonts w:ascii="Times New Roman" w:cs="Times New Roman" w:eastAsia="Times New Roman" w:hAnsi="Times New Roman"/>
+          <w:i/>
+          <w:iCs/>
+          <w:sz w:val="22"/>
+          <w:szCs w:val="22"/>
+        </w:rPr>
+        <w:t xml:space="preserve">arXiv preprint arXiv:2312.17543</w:t>
+      </w:r>
+      <w:r>
+        <w:rPr>
+          <w:rFonts w:ascii="Times New Roman" w:cs="Times New Roman" w:eastAsia="Times New Roman" w:hAnsi="Times New Roman"/>
+          <w:sz w:val="22"/>
+          <w:szCs w:val="22"/>
+        </w:rPr>
+        <w:t xml:space="preserve">.</w:t>
       </w:r>
     </w:p>
     <w:p>

</xml_diff>